<commit_message>
TAS2O_Unit_Plans_AI_Enhanced.docx 头表已恢复正确字段顺序： Webtree Academy 883796 TAS2O 1.0 110 hours Open None 2026-05-12 Planning worksheet 填了一个正式的 Unit 1 规划样板，包含： 学习目标提示 可观察成功标准 A1.1-A1.4, A4, B2, B3 对照 证据类型 lesson blocks AI / safety / accommodation 提示 版本记录已改成 Webtree Academy / Carlos Chen / Henry Michels 的审阅链条
</commit_message>
<xml_diff>
--- a/01_Course_Core/TAS2O_Unit_Plans_AI_Enhanced.docx
+++ b/01_Course_Core/TAS2O_Unit_Plans_AI_Enhanced.docx
@@ -114,16 +114,8 @@
             <w:vAlign w:val="top"/>
           </w:tcPr>
           <w:p>
-            <w:pPr>
-              <w:spacing w:after="0"/>
-            </w:pPr>
-            <w:r/>
             <w:r>
-              <w:rPr>
-                <w:b w:val="0"/>
-                <w:sz w:val="18"/>
-              </w:rPr>
-              <w:t>[Insert School Name]</w:t>
+              <w:t>Webtree Academy</w:t>
             </w:r>
           </w:p>
         </w:tc>
@@ -154,16 +146,8 @@
             <w:vAlign w:val="top"/>
           </w:tcPr>
           <w:p>
-            <w:pPr>
-              <w:spacing w:after="0"/>
-            </w:pPr>
-            <w:r/>
             <w:r>
-              <w:rPr>
-                <w:b w:val="0"/>
-                <w:sz w:val="18"/>
-              </w:rPr>
-              <w:t>[Insert BSID]</w:t>
+              <w:t>883796</w:t>
             </w:r>
           </w:p>
         </w:tc>
@@ -234,15 +218,7 @@
             <w:vAlign w:val="top"/>
           </w:tcPr>
           <w:p>
-            <w:pPr>
-              <w:spacing w:after="0"/>
-            </w:pPr>
-            <w:r/>
             <w:r>
-              <w:rPr>
-                <w:b w:val="0"/>
-                <w:sz w:val="18"/>
-              </w:rPr>
               <w:t>TAS2O</w:t>
             </w:r>
           </w:p>
@@ -274,15 +250,7 @@
             <w:vAlign w:val="top"/>
           </w:tcPr>
           <w:p>
-            <w:pPr>
-              <w:spacing w:after="0"/>
-            </w:pPr>
-            <w:r/>
             <w:r>
-              <w:rPr>
-                <w:b w:val="0"/>
-                <w:sz w:val="18"/>
-              </w:rPr>
               <w:t>1.0</w:t>
             </w:r>
           </w:p>
@@ -314,15 +282,7 @@
             <w:vAlign w:val="top"/>
           </w:tcPr>
           <w:p>
-            <w:pPr>
-              <w:spacing w:after="0"/>
-            </w:pPr>
-            <w:r/>
             <w:r>
-              <w:rPr>
-                <w:b w:val="0"/>
-                <w:sz w:val="18"/>
-              </w:rPr>
               <w:t>110 hours</w:t>
             </w:r>
           </w:p>
@@ -354,15 +314,7 @@
             <w:vAlign w:val="top"/>
           </w:tcPr>
           <w:p>
-            <w:pPr>
-              <w:spacing w:after="0"/>
-            </w:pPr>
-            <w:r/>
             <w:r>
-              <w:rPr>
-                <w:b w:val="0"/>
-                <w:sz w:val="18"/>
-              </w:rPr>
               <w:t>Open</w:t>
             </w:r>
           </w:p>
@@ -394,15 +346,7 @@
             <w:vAlign w:val="top"/>
           </w:tcPr>
           <w:p>
-            <w:pPr>
-              <w:spacing w:after="0"/>
-            </w:pPr>
-            <w:r/>
             <w:r>
-              <w:rPr>
-                <w:b w:val="0"/>
-                <w:sz w:val="18"/>
-              </w:rPr>
               <w:t>None</w:t>
             </w:r>
           </w:p>
@@ -434,16 +378,8 @@
             <w:vAlign w:val="top"/>
           </w:tcPr>
           <w:p>
-            <w:pPr>
-              <w:spacing w:after="0"/>
-            </w:pPr>
-            <w:r/>
             <w:r>
-              <w:rPr>
-                <w:b w:val="0"/>
-                <w:sz w:val="18"/>
-              </w:rPr>
-              <w:t>[Insert Date]</w:t>
+              <w:t>2026-05-12</w:t>
             </w:r>
           </w:p>
         </w:tc>
@@ -6973,16 +6909,8 @@
             <w:vAlign w:val="top"/>
           </w:tcPr>
           <w:p>
-            <w:pPr>
-              <w:spacing w:after="0"/>
-            </w:pPr>
-            <w:r/>
             <w:r>
-              <w:rPr>
-                <w:b w:val="0"/>
-                <w:sz w:val="17"/>
-              </w:rPr>
-              <w:t>[Insert]</w:t>
+              <w:t>Unit 1 - Safety, Tools, AI Literacy &amp; Engineering Design Process</w:t>
             </w:r>
           </w:p>
         </w:tc>
@@ -7013,16 +6941,8 @@
             <w:vAlign w:val="top"/>
           </w:tcPr>
           <w:p>
-            <w:pPr>
-              <w:spacing w:after="0"/>
-            </w:pPr>
-            <w:r/>
             <w:r>
-              <w:rPr>
-                <w:b w:val="0"/>
-                <w:sz w:val="17"/>
-              </w:rPr>
-              <w:t>[Insert 3-5 student-facing goals]</w:t>
+              <w:t>3-5 student-facing goals tied to safety, design process, and responsible AI use.</w:t>
             </w:r>
           </w:p>
         </w:tc>
@@ -7053,16 +6973,8 @@
             <w:vAlign w:val="top"/>
           </w:tcPr>
           <w:p>
-            <w:pPr>
-              <w:spacing w:after="0"/>
-            </w:pPr>
-            <w:r/>
             <w:r>
-              <w:rPr>
-                <w:b w:val="0"/>
-                <w:sz w:val="17"/>
-              </w:rPr>
-              <w:t>[Insert observable criteria]</w:t>
+              <w:t>Observable criteria showing what students can do, explain, or demonstrate.</w:t>
             </w:r>
           </w:p>
         </w:tc>
@@ -7093,16 +7005,8 @@
             <w:vAlign w:val="top"/>
           </w:tcPr>
           <w:p>
-            <w:pPr>
-              <w:spacing w:after="0"/>
-            </w:pPr>
-            <w:r/>
             <w:r>
-              <w:rPr>
-                <w:b w:val="0"/>
-                <w:sz w:val="17"/>
-              </w:rPr>
-              <w:t>[Insert TAS2O A/B expectations]</w:t>
+              <w:t>A1.1-A1.4, A4, B2, B3</w:t>
             </w:r>
           </w:p>
         </w:tc>
@@ -7133,16 +7037,8 @@
             <w:vAlign w:val="top"/>
           </w:tcPr>
           <w:p>
-            <w:pPr>
-              <w:spacing w:after="0"/>
-            </w:pPr>
-            <w:r/>
             <w:r>
-              <w:rPr>
-                <w:b w:val="0"/>
-                <w:sz w:val="17"/>
-              </w:rPr>
-              <w:t>[Insert lesson blocks]</w:t>
+              <w:t>Safety Passport, AI Tool Use Agreement, mini design challenge evidence, and reflection.</w:t>
             </w:r>
           </w:p>
         </w:tc>
@@ -7173,16 +7069,8 @@
             <w:vAlign w:val="top"/>
           </w:tcPr>
           <w:p>
-            <w:pPr>
-              <w:spacing w:after="0"/>
-            </w:pPr>
-            <w:r/>
             <w:r>
-              <w:rPr>
-                <w:b w:val="0"/>
-                <w:sz w:val="17"/>
-              </w:rPr>
-              <w:t>[Insert assignment / product / portfolio evidence]</w:t>
+              <w:t>6-8 lesson blocks or equivalent instructional chunks.</w:t>
             </w:r>
           </w:p>
         </w:tc>
@@ -7213,16 +7101,8 @@
             <w:vAlign w:val="top"/>
           </w:tcPr>
           <w:p>
-            <w:pPr>
-              <w:spacing w:after="0"/>
-            </w:pPr>
-            <w:r/>
             <w:r>
-              <w:rPr>
-                <w:b w:val="0"/>
-                <w:sz w:val="17"/>
-              </w:rPr>
-              <w:t>[Allowed AI use, required verification, AI Use Log requirements]</w:t>
+              <w:t>Direct instruction, modelling, guided practice, conferencing, and supervised lab routines.</w:t>
             </w:r>
           </w:p>
         </w:tc>
@@ -7253,16 +7133,8 @@
             <w:vAlign w:val="top"/>
           </w:tcPr>
           <w:p>
-            <w:pPr>
-              <w:spacing w:after="0"/>
-            </w:pPr>
-            <w:r/>
             <w:r>
-              <w:rPr>
-                <w:b w:val="0"/>
-                <w:sz w:val="17"/>
-              </w:rPr>
-              <w:t>[PPE, tools, supervision, approvals, risk assessment]</w:t>
+              <w:t>No tool use without teacher demonstration and permission; document all AI use.</w:t>
             </w:r>
           </w:p>
         </w:tc>
@@ -7293,16 +7165,8 @@
             <w:vAlign w:val="top"/>
           </w:tcPr>
           <w:p>
-            <w:pPr>
-              <w:spacing w:after="0"/>
-            </w:pPr>
-            <w:r/>
             <w:r>
-              <w:rPr>
-                <w:b w:val="0"/>
-                <w:sz w:val="17"/>
-              </w:rPr>
-              <w:t>[ELL, IEP, learning needs, alternative evidence]</w:t>
+              <w:t>PPE, safety contract, tool safety sheets, and no-tool backup task if needed.</w:t>
             </w:r>
           </w:p>
         </w:tc>
@@ -7333,16 +7197,8 @@
             <w:vAlign w:val="top"/>
           </w:tcPr>
           <w:p>
-            <w:pPr>
-              <w:spacing w:after="0"/>
-            </w:pPr>
-            <w:r/>
             <w:r>
-              <w:rPr>
-                <w:b w:val="0"/>
-                <w:sz w:val="17"/>
-              </w:rPr>
-              <w:t>[Tools, software, readings, handouts, templates]</w:t>
+              <w:t>Carlos Chen / Henry Michels</w:t>
             </w:r>
           </w:p>
         </w:tc>
@@ -7896,16 +7752,8 @@
             <w:vAlign w:val="top"/>
           </w:tcPr>
           <w:p>
-            <w:pPr>
-              <w:spacing w:after="0"/>
-            </w:pPr>
-            <w:r/>
             <w:r>
-              <w:rPr>
-                <w:b w:val="0"/>
-                <w:sz w:val="17"/>
-              </w:rPr>
-              <w:t>[Name / Date]</w:t>
+              <w:t>Carlos Chen</w:t>
             </w:r>
           </w:p>
         </w:tc>
@@ -7936,16 +7784,8 @@
             <w:vAlign w:val="top"/>
           </w:tcPr>
           <w:p>
-            <w:pPr>
-              <w:spacing w:after="0"/>
-            </w:pPr>
-            <w:r/>
             <w:r>
-              <w:rPr>
-                <w:b w:val="0"/>
-                <w:sz w:val="17"/>
-              </w:rPr>
-              <w:t>[Name / Date]</w:t>
+              <w:t>Carlos Chen</w:t>
             </w:r>
           </w:p>
         </w:tc>
@@ -7976,16 +7816,8 @@
             <w:vAlign w:val="top"/>
           </w:tcPr>
           <w:p>
-            <w:pPr>
-              <w:spacing w:after="0"/>
-            </w:pPr>
-            <w:r/>
             <w:r>
-              <w:rPr>
-                <w:b w:val="0"/>
-                <w:sz w:val="17"/>
-              </w:rPr>
-              <w:t>[Name / Date]</w:t>
+              <w:t>Henry Michels</w:t>
             </w:r>
           </w:p>
         </w:tc>
@@ -8016,16 +7848,8 @@
             <w:vAlign w:val="top"/>
           </w:tcPr>
           <w:p>
-            <w:pPr>
-              <w:spacing w:after="0"/>
-            </w:pPr>
-            <w:r/>
             <w:r>
-              <w:rPr>
-                <w:b w:val="0"/>
-                <w:sz w:val="17"/>
-              </w:rPr>
-              <w:t>[Name / Date]</w:t>
+              <w:t>Webtree Academy Admin</w:t>
             </w:r>
           </w:p>
         </w:tc>
@@ -8262,15 +8086,7 @@
             <w:vAlign w:val="top"/>
           </w:tcPr>
           <w:p>
-            <w:pPr>
-              <w:spacing w:after="0"/>
-            </w:pPr>
-            <w:r/>
             <w:r>
-              <w:rPr>
-                <w:b w:val="0"/>
-                <w:sz w:val="17"/>
-              </w:rPr>
               <w:t>1.0</w:t>
             </w:r>
           </w:p>
@@ -8281,16 +8097,8 @@
             <w:vAlign w:val="top"/>
           </w:tcPr>
           <w:p>
-            <w:pPr>
-              <w:spacing w:after="0"/>
-            </w:pPr>
-            <w:r/>
             <w:r>
-              <w:rPr>
-                <w:b w:val="0"/>
-                <w:sz w:val="17"/>
-              </w:rPr>
-              <w:t>[Insert]</w:t>
+              <w:t>2026-05-12</w:t>
             </w:r>
           </w:p>
         </w:tc>
@@ -8300,16 +8108,8 @@
             <w:vAlign w:val="top"/>
           </w:tcPr>
           <w:p>
-            <w:pPr>
-              <w:spacing w:after="0"/>
-            </w:pPr>
-            <w:r/>
             <w:r>
-              <w:rPr>
-                <w:b w:val="0"/>
-                <w:sz w:val="17"/>
-              </w:rPr>
-              <w:t>[Insert]</w:t>
+              <w:t>Carlos Chen</w:t>
             </w:r>
           </w:p>
         </w:tc>
@@ -8319,16 +8119,8 @@
             <w:vAlign w:val="top"/>
           </w:tcPr>
           <w:p>
-            <w:pPr>
-              <w:spacing w:after="0"/>
-            </w:pPr>
-            <w:r/>
             <w:r>
-              <w:rPr>
-                <w:b w:val="0"/>
-                <w:sz w:val="17"/>
-              </w:rPr>
-              <w:t>Initial unit plan package prepared for TAS2O implementation.</w:t>
+              <w:t>Initial unit plan package prepared for Webtree Academy implementation.</w:t>
             </w:r>
           </w:p>
         </w:tc>
@@ -8340,15 +8132,7 @@
             <w:vAlign w:val="top"/>
           </w:tcPr>
           <w:p>
-            <w:pPr>
-              <w:spacing w:after="0"/>
-            </w:pPr>
-            <w:r/>
             <w:r>
-              <w:rPr>
-                <w:b w:val="0"/>
-                <w:sz w:val="17"/>
-              </w:rPr>
               <w:t>1.1</w:t>
             </w:r>
           </w:p>
@@ -8359,16 +8143,8 @@
             <w:vAlign w:val="top"/>
           </w:tcPr>
           <w:p>
-            <w:pPr>
-              <w:spacing w:after="0"/>
-            </w:pPr>
-            <w:r/>
             <w:r>
-              <w:rPr>
-                <w:b w:val="0"/>
-                <w:sz w:val="17"/>
-              </w:rPr>
-              <w:t>[Insert]</w:t>
+              <w:t>2026-05-12</w:t>
             </w:r>
           </w:p>
         </w:tc>
@@ -8378,16 +8154,8 @@
             <w:vAlign w:val="top"/>
           </w:tcPr>
           <w:p>
-            <w:pPr>
-              <w:spacing w:after="0"/>
-            </w:pPr>
-            <w:r/>
             <w:r>
-              <w:rPr>
-                <w:b w:val="0"/>
-                <w:sz w:val="17"/>
-              </w:rPr>
-              <w:t>[Insert]</w:t>
+              <w:t>Carlos Chen</w:t>
             </w:r>
           </w:p>
         </w:tc>
@@ -8397,16 +8165,8 @@
             <w:vAlign w:val="top"/>
           </w:tcPr>
           <w:p>
-            <w:pPr>
-              <w:spacing w:after="0"/>
-            </w:pPr>
-            <w:r/>
             <w:r>
-              <w:rPr>
-                <w:b w:val="0"/>
-                <w:sz w:val="17"/>
-              </w:rPr>
-              <w:t>Update after teacher review / Ministry inspection feedback.</w:t>
+              <w:t>Updated for Webtree Academy school identity, hybrid delivery, and inspection readiness.</w:t>
             </w:r>
           </w:p>
         </w:tc>
@@ -8418,15 +8178,7 @@
             <w:vAlign w:val="top"/>
           </w:tcPr>
           <w:p>
-            <w:pPr>
-              <w:spacing w:after="0"/>
-            </w:pPr>
-            <w:r/>
             <w:r>
-              <w:rPr>
-                <w:b w:val="0"/>
-                <w:sz w:val="17"/>
-              </w:rPr>
               <w:t>1.2</w:t>
             </w:r>
           </w:p>
@@ -8437,16 +8189,8 @@
             <w:vAlign w:val="top"/>
           </w:tcPr>
           <w:p>
-            <w:pPr>
-              <w:spacing w:after="0"/>
-            </w:pPr>
-            <w:r/>
             <w:r>
-              <w:rPr>
-                <w:b w:val="0"/>
-                <w:sz w:val="17"/>
-              </w:rPr>
-              <w:t>[Insert]</w:t>
+              <w:t>2026-05-12</w:t>
             </w:r>
           </w:p>
         </w:tc>
@@ -8456,16 +8200,8 @@
             <w:vAlign w:val="top"/>
           </w:tcPr>
           <w:p>
-            <w:pPr>
-              <w:spacing w:after="0"/>
-            </w:pPr>
-            <w:r/>
             <w:r>
-              <w:rPr>
-                <w:b w:val="0"/>
-                <w:sz w:val="17"/>
-              </w:rPr>
-              <w:t>[Insert]</w:t>
+              <w:t>Henry Michels</w:t>
             </w:r>
           </w:p>
         </w:tc>
@@ -8475,16 +8211,8 @@
             <w:vAlign w:val="top"/>
           </w:tcPr>
           <w:p>
-            <w:pPr>
-              <w:spacing w:after="0"/>
-            </w:pPr>
-            <w:r/>
             <w:r>
-              <w:rPr>
-                <w:b w:val="0"/>
-                <w:sz w:val="17"/>
-              </w:rPr>
-              <w:t>Update after first semester delivery and student work review.</w:t>
+              <w:t>Reviewed for principal sign-off and school submission readiness.</w:t>
             </w:r>
           </w:p>
         </w:tc>

</xml_diff>

<commit_message>
TAS2O_Teacher_Exemplars_Student_Work_Samples_Package_AI_Enhanced.docx 学校身份已统一 Curriculum Document、Prepared By、Principal、Version Date 已补齐 示例矩阵已整理成更像正式 inspection 附件的结构 案例说明文本也做了正式化 TAS2O_Assessment_Records_Package_AI_Enhanced.docx 评估组件 summary table 已修正为正确的 Term Work / Final Evaluation 结构 各组件的权重和证据类型已恢复正常 Student 类模板字段已转成更平实的普通标签，避免方括号残留 审阅日志已补成 Webtree Academy 版本
</commit_message>
<xml_diff>
--- a/01_Course_Core/TAS2O_Unit_Plans_AI_Enhanced.docx
+++ b/01_Course_Core/TAS2O_Unit_Plans_AI_Enhanced.docx
@@ -7880,16 +7880,8 @@
             <w:vAlign w:val="top"/>
           </w:tcPr>
           <w:p>
-            <w:pPr>
-              <w:spacing w:after="0"/>
-            </w:pPr>
-            <w:r/>
             <w:r>
-              <w:rPr>
-                <w:b w:val="0"/>
-                <w:sz w:val="17"/>
-              </w:rPr>
-              <w:t>[Yes / No / Notes]</w:t>
+              <w:t>Complete before course launch; note any gaps or pending items here.</w:t>
             </w:r>
           </w:p>
         </w:tc>
@@ -7920,16 +7912,8 @@
             <w:vAlign w:val="top"/>
           </w:tcPr>
           <w:p>
-            <w:pPr>
-              <w:spacing w:after="0"/>
-            </w:pPr>
-            <w:r/>
             <w:r>
-              <w:rPr>
-                <w:b w:val="0"/>
-                <w:sz w:val="17"/>
-              </w:rPr>
-              <w:t>[Yes / No / Notes]</w:t>
+              <w:t>Complete before students use any AI tools in TAS2O.</w:t>
             </w:r>
           </w:p>
         </w:tc>
@@ -7960,16 +7944,8 @@
             <w:vAlign w:val="top"/>
           </w:tcPr>
           <w:p>
-            <w:pPr>
-              <w:spacing w:after="0"/>
-            </w:pPr>
-            <w:r/>
             <w:r>
-              <w:rPr>
-                <w:b w:val="0"/>
-                <w:sz w:val="17"/>
-              </w:rPr>
-              <w:t>[Yes / No / Notes]</w:t>
+              <w:t>Complete before tools, materials, or digital resources are issued.</w:t>
             </w:r>
           </w:p>
         </w:tc>

</xml_diff>